<commit_message>
Master template document update.
</commit_message>
<xml_diff>
--- a/assets/Tracy_Hills_II_HOA_ARC_Landscaping_Submittal_Master_Template_2026.docx
+++ b/assets/Tracy_Hills_II_HOA_ARC_Landscaping_Submittal_Master_Template_2026.docx
@@ -53,6 +53,16 @@
                 <w:sz w:val="20"/>
               </w:rPr>
               <w:t>UNIVERSAL ARCHITECTURAL &amp; LANDSCAPE SUBMITTAL MASTER TEMPLATE</w:t>
+            </w:r>
+            <w:r>
+              <w:rPr>
+                <w:rFonts w:ascii="Calibri" w:hAnsi="Calibri"/>
+                <w:b/>
+                <w:color w:val="E2E8F0"/>
+                <w:sz w:val="20"/>
+              </w:rPr>
+              <w:br/>
+              <w:t>Resident Preparation &amp; Organization Tool — Not an Official HOA Form</w:t>
             </w:r>
           </w:p>
         </w:tc>
@@ -96,7 +106,7 @@
                 <w:color w:val="B7791F"/>
                 <w:sz w:val="19"/>
               </w:rPr>
-              <w:t>💡 TIP / INSTRUCTION ONLY — STANDARDIZED TEMPLATE USER GUIDE</w:t>
+              <w:t>💡 TIP / INSTRUCTION ONLY — HOW TO USE THIS RESIDENT PREPARATION TEMPLATE</w:t>
             </w:r>
             <w:r>
               <w:rPr>
@@ -114,7 +124,7 @@
                 <w:color w:val="2D3748"/>
                 <w:sz w:val="18"/>
               </w:rPr>
-              <w:t>• THIS IS A 100% BLANK, UNBIASED MASTER TEMPLATE designed to comply directly with Tracy Hills II CC&amp;Rs, Bylaws, Design Guidelines (V12), and the Phase 2 Fire Protection Plan (FPP).</w:t>
+              <w:t>• PURPOSE: This community-created template is an organizational aid designed to help residents assemble information commonly required for an ARC submittal. It contains guideline-aligned prompts, examples, and document references. It does not replace the Association's official forms, governing documents, Architectural Guidelines, Fire Protection Plan, or Management instructions.</w:t>
             </w:r>
             <w:r>
               <w:rPr>
@@ -124,7 +134,7 @@
                 <w:sz w:val="18"/>
               </w:rPr>
               <w:br/>
-              <w:t>• MODULAR SELECTION: Every exterior improvement is optional. In Section 2 and Form C, mark [X] Yes for what you are installing, and [X] No for what you are not installing.</w:t>
+              <w:t>• MODULAR SELECTION: Every exterior improvement is optional. Select only the sections applicable to your specific project and delete unused modules.</w:t>
             </w:r>
             <w:r>
               <w:rPr>
@@ -134,7 +144,7 @@
                 <w:sz w:val="18"/>
               </w:rPr>
               <w:br/>
-              <w:t>• FILL IN RED BRACKETS: Replace all red text placeholders [LIKE THIS] with your own lot details, chosen dimensions, colors, and materials.</w:t>
+              <w:t>• FILL IN RED BRACKETS: Replace all red text placeholders [LIKE THIS] with your lot details, proposed dimensions, colors, and materials.</w:t>
             </w:r>
             <w:r>
               <w:rPr>
@@ -144,7 +154,7 @@
                 <w:sz w:val="18"/>
               </w:rPr>
               <w:br/>
-              <w:t>• EXHIBIT G (ARC PHOTO/CUT SHEET MANDATE): The ARC requires photos or sample cuts for ALL proposed items. Simply paste product cuts/photos into the boxes for items you checked Yes, and delete the unused boxes.</w:t>
+              <w:t>• VERIFY REQUIREMENTS: Completion of this template does not guarantee ARC approval. Confirm current forms, fees, and requirements with Management before submitting.</w:t>
             </w:r>
           </w:p>
         </w:tc>
@@ -504,7 +514,7 @@
                 <w:color w:val="1A365D"/>
                 <w:sz w:val="18"/>
               </w:rPr>
-              <w:t>Review Type &amp; Fees:</w:t>
+              <w:t>Review Classification:</w:t>
             </w:r>
           </w:p>
         </w:tc>
@@ -523,10 +533,124 @@
             <w:r>
               <w:rPr>
                 <w:rFonts w:ascii="Calibri" w:hAnsi="Calibri"/>
+                <w:b/>
+                <w:color w:val="C53030"/>
+                <w:sz w:val="18"/>
+              </w:rPr>
+              <w:t>[ ] Exempt   [ ] Pre-Approved   [ ] Minor Review   [ ] Full Review   [ ] Unsure (Verify w/ Mgmt)</w:t>
+            </w:r>
+          </w:p>
+        </w:tc>
+      </w:tr>
+      <w:tr>
+        <w:trPr>
+          <w:jc w:val="center"/>
+        </w:trPr>
+        <w:tc>
+          <w:tcPr>
+            <w:tcW w:w="3168" w:type="dxa"/>
+            <w:shd w:val="clear" w:color="auto" w:fill="F7FAFC"/>
+            <w:tcMar>
+              <w:top w:w="45" w:type="dxa"/>
+              <w:left w:w="90" w:type="dxa"/>
+              <w:bottom w:w="45" w:type="dxa"/>
+              <w:right w:w="90" w:type="dxa"/>
+            </w:tcMar>
+          </w:tcPr>
+          <w:p>
+            <w:r>
+              <w:rPr>
+                <w:rFonts w:ascii="Calibri" w:hAnsi="Calibri"/>
+                <w:b/>
+                <w:color w:val="1A365D"/>
+                <w:sz w:val="18"/>
+              </w:rPr>
+              <w:t>Applicable Fees on File:</w:t>
+            </w:r>
+          </w:p>
+        </w:tc>
+        <w:tc>
+          <w:tcPr>
+            <w:tcW w:w="6624" w:type="dxa"/>
+            <w:shd w:val="clear" w:color="auto" w:fill="FFFFFF"/>
+            <w:tcMar>
+              <w:top w:w="45" w:type="dxa"/>
+              <w:left w:w="90" w:type="dxa"/>
+              <w:bottom w:w="45" w:type="dxa"/>
+              <w:right w:w="90" w:type="dxa"/>
+            </w:tcMar>
+          </w:tcPr>
+          <w:p>
+            <w:r>
+              <w:rPr>
+                <w:rFonts w:ascii="Calibri" w:hAnsi="Calibri"/>
+                <w:b/>
+                <w:color w:val="C53030"/>
+                <w:sz w:val="18"/>
+              </w:rPr>
+              <w:t>[✏️ Specify fee/deposit per classification: e.g., Minor $175 / Full $200 + $250 Deposit]</w:t>
+            </w:r>
+          </w:p>
+        </w:tc>
+      </w:tr>
+    </w:tbl>
+    <w:p>
+      <w:pPr>
+        <w:spacing w:after="40"/>
+      </w:pPr>
+    </w:p>
+    <w:tbl>
+      <w:tblPr>
+        <w:tblW w:w="0" w:type="auto"/>
+        <w:jc w:val="center"/>
+        <w:tblLayout w:type="fixed"/>
+        <w:tblLook w:val="04A0" w:firstRow="1" w:lastRow="0" w:firstColumn="1" w:lastColumn="0" w:noHBand="0" w:noVBand="1"/>
+      </w:tblPr>
+      <w:tblGrid>
+        <w:gridCol w:w="9936"/>
+      </w:tblGrid>
+      <w:tr>
+        <w:trPr>
+          <w:jc w:val="center"/>
+        </w:trPr>
+        <w:tc>
+          <w:tcPr>
+            <w:tcW w:w="9936" w:type="dxa"/>
+            <w:shd w:val="clear" w:color="auto" w:fill="FEFCBF"/>
+            <w:tcMar>
+              <w:top w:w="80" w:type="dxa"/>
+              <w:left w:w="120" w:type="dxa"/>
+              <w:bottom w:w="80" w:type="dxa"/>
+              <w:right w:w="120" w:type="dxa"/>
+            </w:tcMar>
+          </w:tcPr>
+          <w:p>
+            <w:r>
+              <w:rPr>
+                <w:rFonts w:ascii="Calibri" w:hAnsi="Calibri"/>
+                <w:b/>
+                <w:color w:val="B7791F"/>
+                <w:sz w:val="19"/>
+              </w:rPr>
+              <w:t>💡 TIP / INSTRUCTION ONLY — HOA APPROVAL ≠ CITY / GOVERNMENT PERMITS</w:t>
+            </w:r>
+            <w:r>
+              <w:rPr>
+                <w:rFonts w:ascii="Calibri" w:hAnsi="Calibri"/>
+                <w:b/>
+                <w:color w:val="B7791F"/>
+                <w:sz w:val="19"/>
+              </w:rPr>
+              <w:br/>
+            </w:r>
+            <w:r>
+              <w:rPr>
+                <w:rFonts w:ascii="Calibri" w:hAnsi="Calibri"/>
+                <w:i/>
                 <w:color w:val="2D3748"/>
                 <w:sz w:val="18"/>
               </w:rPr>
-              <w:t>Full Review ($200 non-refundable check) + $250 Refundable Security Deposit Check</w:t>
+              <w:t>ARC approval addresses compliance solely with Association governing documents and guidelines. It does not replace building permits, zoning compliance, or municipal inspections required by the City of Tracy. Obtaining a City permit does not waive the requirement for ARC approval.</w:t>
             </w:r>
           </w:p>
         </w:tc>
@@ -549,7 +673,7 @@
           <w:color w:val="1A365D"/>
           <w:sz w:val="24"/>
         </w:rPr>
-        <w:t>SECTION 2: Standard Modular Hardscape &amp; Structure Menu (Select Items to Include)</w:t>
+        <w:t>SECTION 2: Modular Project Scope &amp; Hardscape Menu (Select All That Apply)</w:t>
       </w:r>
     </w:p>
     <w:tbl>
@@ -585,7 +709,7 @@
                 <w:color w:val="B7791F"/>
                 <w:sz w:val="19"/>
               </w:rPr>
-              <w:t>💡 TIP / INSTRUCTION ONLY — GOVERNING HOA RULES FOR INSTALLED HARDSCAPE</w:t>
+              <w:t>💡 TIP / INSTRUCTION ONLY — GOVERNING GUIDELINE REFERENCES (VERIFY APPLICABILITY)</w:t>
             </w:r>
             <w:r>
               <w:rPr>
@@ -603,7 +727,8 @@
                 <w:color w:val="2D3748"/>
                 <w:sz w:val="18"/>
               </w:rPr>
-              <w:t>1. PATIO COVERS / PERGOLAS: Must be non-combustible heavy-gauge aluminum (CBC Chapter 7A / FPP Appendix B). Combustible wood covers are prohibited in Phase 2.</w:t>
+              <w:lastRenderedPageBreak/>
+              <w:t>1. PATIO COVERS / SHADE STRUCTURES: Subject to FPP Appendix B and CBC Chapter 7A wildfire ignition-resistance standards. Non-combustible heavy-gauge aluminum is a recommended approach for Phase 2.</w:t>
             </w:r>
             <w:r>
               <w:rPr>
@@ -613,7 +738,7 @@
                 <w:sz w:val="18"/>
               </w:rPr>
               <w:br/>
-              <w:t>2. RETAINING WALLS: Maximum permitted height is 24 inches from finished grade per Section IV.B.5.i.</w:t>
+              <w:t>2. RETAINING WALLS: Maximum permitted height is 24 inches (2 feet) from finished grade per Section IV.B.5.i.</w:t>
             </w:r>
             <w:r>
               <w:rPr>
@@ -633,7 +758,7 @@
                 <w:sz w:val="18"/>
               </w:rPr>
               <w:br/>
-              <w:t>4. DRAINAGE: Minimum 1.0% slope away from home on hardscape, 2.0% slope on landscape beds. Direct tie-in to builder storm drain lines.</w:t>
+              <w:t>4. DRAINAGE: Maintain established patterns. Hardscape requires min 1.0% slope away from structures; landscape requires min 2.0% slope. Connect new inlets to Declarant system where required.</w:t>
             </w:r>
           </w:p>
         </w:tc>
@@ -725,7 +850,7 @@
                 <w:color w:val="FFFFFF"/>
                 <w:sz w:val="18"/>
               </w:rPr>
-              <w:t>Standard Pre-Approved Language</w:t>
+              <w:t>Standard Guideline-Aligned Language</w:t>
             </w:r>
           </w:p>
         </w:tc>
@@ -798,7 +923,7 @@
                 <w:color w:val="2D3748"/>
                 <w:sz w:val="17"/>
               </w:rPr>
-              <w:t>• Material: 100% heavy-gauge extruded aluminum, powder-coated in neutral earth-tone/slate finish (non-combustible per FPP Appendix B &amp; CBC Chapter 7A).</w:t>
+              <w:t>• Material &amp; Assembly: Heavy-gauge extruded aluminum (recommended non-combustible approach for Phase 2 per FPP Appendix B / CBC Chapter 7A) or fire-retardant treated assembly meeting applicable standards.</w:t>
             </w:r>
             <w:r>
               <w:rPr>
@@ -816,15 +941,7 @@
                 <w:sz w:val="17"/>
               </w:rPr>
               <w:br/>
-            </w:r>
-            <w:r>
-              <w:rPr>
-                <w:rFonts w:ascii="Calibri" w:hAnsi="Calibri"/>
-                <w:color w:val="2D3748"/>
-                <w:sz w:val="17"/>
-              </w:rPr>
-              <w:lastRenderedPageBreak/>
-              <w:t>• Required Setbacks: Maintained minimum [✏️ Specify: e.g., __'-0"] from rear fence (min 5'-0" required) and [✏️ Specify: e.g., __'-0"] from side fence (min 3'-0" required).</w:t>
+              <w:t>• Setbacks: Minimum 3'-0" from side property lines; 5'-0" from rear property line (7'-0" from rear property line if adjacent to a street per V12 §IV.B.6).</w:t>
             </w:r>
           </w:p>
         </w:tc>
@@ -852,7 +969,6 @@
                 <w:color w:val="1A365D"/>
                 <w:sz w:val="17"/>
               </w:rPr>
-              <w:lastRenderedPageBreak/>
               <w:t>Concrete Flatwork / Paving / Walkways</w:t>
             </w:r>
           </w:p>
@@ -989,7 +1105,7 @@
                 <w:color w:val="2D3748"/>
                 <w:sz w:val="17"/>
               </w:rPr>
-              <w:t>• Height: Maximum [✏️ Specify: e.g., 18", 20", or 24"] height from finished grade (strictly ≤ 24" HOA limit per Section IV.B.5.i).</w:t>
+              <w:t>• Height Limit: Maximum permitted height is 24 inches (2 feet) from finished grade per Section IV.B.5.i. Retaining walls are not permitted adjacent to the existing Residence.</w:t>
             </w:r>
             <w:r>
               <w:rPr>
@@ -998,7 +1114,7 @@
                 <w:sz w:val="17"/>
               </w:rPr>
               <w:br/>
-              <w:t>• Construction &amp; Facing: Concrete masonry block faced with [✏️ Specify: e.g., natural stacked stone ledger veneer, brick, or stucco] with solid cap.</w:t>
+              <w:t>• Construction &amp; Facing: Concrete masonry block faced with [✏️ Specify: e.g., stacked stone ledger veneer, brick, or stucco] with solid masonry cap.</w:t>
             </w:r>
             <w:r>
               <w:rPr>
@@ -1007,7 +1123,7 @@
                 <w:sz w:val="17"/>
               </w:rPr>
               <w:br/>
-              <w:t>• Sub-drain &amp; Waterproofing: Back-sealed with Thoroseal waterproofing and perforated sub-drain tied into builder storm drainage system.</w:t>
+              <w:t>• Drainage &amp; Waterproofing: Where soil is mounded or raised planters occur, provide required clearances (18" clear of perimeter walls) and adequate waterproofing/sub-drainage.</w:t>
             </w:r>
           </w:p>
         </w:tc>
@@ -1363,6 +1479,7 @@
                 <w:color w:val="1A365D"/>
                 <w:sz w:val="17"/>
               </w:rPr>
+              <w:lastRenderedPageBreak/>
               <w:t>Storage Shed</w:t>
             </w:r>
           </w:p>
@@ -1609,7 +1726,6 @@
                 <w:color w:val="1A365D"/>
                 <w:sz w:val="17"/>
               </w:rPr>
-              <w:lastRenderedPageBreak/>
               <w:t>Turf (Natural Sod vs. Synthetic)</w:t>
             </w:r>
           </w:p>
@@ -1788,7 +1904,7 @@
           <w:sz w:val="24"/>
         </w:rPr>
         <w:lastRenderedPageBreak/>
-        <w:t>SECTION 3: Standard Pre-Approved Planting Palette (100% Non-Pyrophytic / FPP Compliant)</w:t>
+        <w:t>SECTION 3: Sample Planting Palette (Verify Against Current FPP Appendix A)</w:t>
       </w:r>
     </w:p>
     <w:tbl>
@@ -1824,7 +1940,7 @@
                 <w:color w:val="B7791F"/>
                 <w:sz w:val="19"/>
               </w:rPr>
-              <w:t>💡 TIP / INSTRUCTION ONLY — PLANTING &amp; SETBACK GUIDELINES</w:t>
+              <w:t>💡 TIP / INSTRUCTION ONLY — PLANTING &amp; SETBACK GUIDELINES (V12 §IV.D.6 &amp; FPP APPENDIX A)</w:t>
             </w:r>
             <w:r>
               <w:rPr>
@@ -1842,7 +1958,7 @@
                 <w:color w:val="2D3748"/>
                 <w:sz w:val="18"/>
               </w:rPr>
-              <w:t>1. TREE SETBACK RULE: All trees must be planted a minimum of 5'-0" from property lines and fences with root barriers (Section IV.D.6).</w:t>
+              <w:t>1. TREE SETBACKS: Proposed trees should be kept at least 5'-0" from property lines and boundary fences (V12 §IV.D.6).</w:t>
             </w:r>
             <w:r>
               <w:rPr>
@@ -1852,7 +1968,7 @@
                 <w:sz w:val="18"/>
               </w:rPr>
               <w:br/>
-              <w:t>2. PROHIBITED PLANTS: Appendix A of the Fire Protection Plan strictly prohibits Italian Cypress, Palms, Pines, Junipers, Bamboo, and Eucalyptus.</w:t>
+              <w:t>2. ROOT BARRIERS: Trees planted within 5'-0" of perimeter walls and/or adjoining residences must incorporate an approved root-barrier device.</w:t>
             </w:r>
             <w:r>
               <w:rPr>
@@ -1862,7 +1978,17 @@
                 <w:sz w:val="18"/>
               </w:rPr>
               <w:br/>
-              <w:t>3. SELECTION: Check the boxes below for any plants you are including on your lot. You may also add custom fire-safe plants.</w:t>
+              <w:t>3. PROHIBITED SPECIES: Proposed vegetation must comply with the complete FPP Appendix A schedule. Prohibited species include Cypress, Palms, Pines, Junipers, Bamboo, and Eucalyptus.</w:t>
+            </w:r>
+            <w:r>
+              <w:rPr>
+                <w:rFonts w:ascii="Calibri" w:hAnsi="Calibri"/>
+                <w:i/>
+                <w:color w:val="2D3748"/>
+                <w:sz w:val="18"/>
+              </w:rPr>
+              <w:br/>
+              <w:t>4. SAMPLE PALETTE ONLY: The plants below are examples for consideration. Residents must verify each proposed species against the official schedule.</w:t>
             </w:r>
           </w:p>
         </w:tc>
@@ -3456,7 +3582,7 @@
                 <w:color w:val="2D3748"/>
                 <w:sz w:val="17"/>
               </w:rPr>
-              <w:t>[Custom Safe Plant]</w:t>
+              <w:t>[Proposed Plant]</w:t>
             </w:r>
           </w:p>
         </w:tc>
@@ -3478,7 +3604,7 @@
                 <w:color w:val="2D3748"/>
                 <w:sz w:val="17"/>
               </w:rPr>
-              <w:t>[Custom Fire-Safe Shrub/Tree]</w:t>
+              <w:t>[Custom Shrub/Tree — Verify FPP]</w:t>
             </w:r>
           </w:p>
         </w:tc>
@@ -3567,7 +3693,7 @@
           <w:color w:val="1A365D"/>
           <w:sz w:val="24"/>
         </w:rPr>
-        <w:t>SECTION 4: Standard Drainage, Grading &amp; Environmental Compliance Statements</w:t>
+        <w:t>SECTION 4: Recommended Drainage, Grading &amp; Environmental Compliance Statement</w:t>
       </w:r>
     </w:p>
     <w:tbl>
@@ -3603,7 +3729,7 @@
                 <w:color w:val="B7791F"/>
                 <w:sz w:val="19"/>
               </w:rPr>
-              <w:t>💡 TIP / INSTRUCTION ONLY — DRAINAGE &amp; RUNOFF RULES</w:t>
+              <w:t>💡 TIP / INSTRUCTION ONLY — DRAINAGE &amp; RUNOFF GUIDELINE (V12 §IV.B.3 / FORM G)</w:t>
             </w:r>
             <w:r>
               <w:rPr>
@@ -3621,7 +3747,7 @@
                 <w:color w:val="2D3748"/>
                 <w:sz w:val="18"/>
               </w:rPr>
-              <w:t>To prevent water damage or nuisance disputes, the HOA strictly prohibits runoff onto neighbor lots. Every approved submittal must contain these verbatim engineering statements:</w:t>
+              <w:t>Hardscape surfaces require minimum 1.0% positive drainage; landscape areas require minimum 2.0% positive drainage directed away from structures. Do not direct runoff or sheet flow onto adjacent lots. New drain inlets and sub-drains must connect to the existing drainage system provided by the Declarant.</w:t>
             </w:r>
           </w:p>
         </w:tc>
@@ -3642,7 +3768,8 @@
           <w:color w:val="2D3748"/>
           <w:sz w:val="18"/>
         </w:rPr>
-        <w:t>Verbatim Association Drainage Clauses:</w:t>
+        <w:lastRenderedPageBreak/>
+        <w:t>Sample Drainage Statement (Customize to Your Project):</w:t>
       </w:r>
       <w:r>
         <w:rPr>
@@ -3651,7 +3778,7 @@
           <w:sz w:val="18"/>
         </w:rPr>
         <w:br/>
-        <w:t>1. Positive Surface Slopes: All concrete/hardscape flatwork maintains a 1.0% minimum slope away from structural walls. All softscape/planting areas maintain a 2.0% minimum positive slope towards area drains.</w:t>
+        <w:t>1. Positive Surface Slopes: All hardscape flatwork maintains a minimum 1.0% positive slope away from structural walls. All softscape/planting areas maintain a minimum 2.0% positive slope directed towards area drains or swales.</w:t>
       </w:r>
       <w:r>
         <w:rPr>
@@ -3660,16 +3787,7 @@
           <w:sz w:val="18"/>
         </w:rPr>
         <w:br/>
-        <w:t xml:space="preserve">2. Underground Closed Storm System: All downspout adapters, surface catch basins, and retaining wall sub-drains are piped </w:t>
-      </w:r>
-      <w:r>
-        <w:rPr>
-          <w:rFonts w:ascii="Calibri" w:hAnsi="Calibri"/>
-          <w:color w:val="2D3748"/>
-          <w:sz w:val="18"/>
-        </w:rPr>
-        <w:lastRenderedPageBreak/>
-        <w:t>underground in Schedule 40 PVC to connect directly into the builder-installed in-ground storm drain line. Zero water will sheet-flow onto neighboring lots.</w:t>
+        <w:t>2. Declarant Drainage System Connection: New surface catch basins, downspout adapters, and retaining wall sub-drains are piped underground to connect directly into the existing drainage system provided by the Declarant, where required. Drainage is directed away from structures and does not create runoff or sheet flow onto neighboring lots.</w:t>
       </w:r>
       <w:r>
         <w:rPr>
@@ -3678,7 +3796,7 @@
           <w:sz w:val="18"/>
         </w:rPr>
         <w:br/>
-        <w:t>3. Water Quality BMPs: All work will strictly comply with Form G (Water Quality Management BMP Guidelines). Area drains will be protected during grading/construction.</w:t>
+        <w:t>3. Water Quality BMPs: All work will comply with Form G (Water Quality Management BMP Guidelines). Area drains will be protected during grading/construction.</w:t>
       </w:r>
     </w:p>
     <w:p>
@@ -3737,69 +3855,17 @@
                 <w:color w:val="E2E8F0"/>
                 <w:sz w:val="20"/>
               </w:rPr>
-              <w:t>ARCHITECTURAL REVIEW APPLICATION CHECKLIST</w:t>
-            </w:r>
-          </w:p>
-        </w:tc>
-      </w:tr>
-    </w:tbl>
-    <w:p>
-      <w:pPr>
-        <w:spacing w:after="80"/>
-      </w:pPr>
-    </w:p>
-    <w:tbl>
-      <w:tblPr>
-        <w:tblW w:w="0" w:type="auto"/>
-        <w:jc w:val="center"/>
-        <w:tblLayout w:type="fixed"/>
-        <w:tblLook w:val="04A0" w:firstRow="1" w:lastRow="0" w:firstColumn="1" w:lastColumn="0" w:noHBand="0" w:noVBand="1"/>
-      </w:tblPr>
-      <w:tblGrid>
-        <w:gridCol w:w="9936"/>
-      </w:tblGrid>
-      <w:tr>
-        <w:trPr>
-          <w:jc w:val="center"/>
-        </w:trPr>
-        <w:tc>
-          <w:tcPr>
-            <w:tcW w:w="9936" w:type="dxa"/>
-            <w:shd w:val="clear" w:color="auto" w:fill="FEFCBF"/>
-            <w:tcMar>
-              <w:top w:w="80" w:type="dxa"/>
-              <w:left w:w="120" w:type="dxa"/>
-              <w:bottom w:w="80" w:type="dxa"/>
-              <w:right w:w="120" w:type="dxa"/>
-            </w:tcMar>
-          </w:tcPr>
-          <w:p>
+              <w:t>DESIGN REVIEW APPLICATION CHECKLIST</w:t>
+            </w:r>
             <w:r>
               <w:rPr>
                 <w:rFonts w:ascii="Calibri" w:hAnsi="Calibri"/>
                 <w:b/>
-                <w:color w:val="B7791F"/>
-                <w:sz w:val="19"/>
-              </w:rPr>
-              <w:t>💡 TIP / INSTRUCTION ONLY — FORM B INSTRUCTION</w:t>
-            </w:r>
-            <w:r>
-              <w:rPr>
-                <w:rFonts w:ascii="Calibri" w:hAnsi="Calibri"/>
-                <w:b/>
-                <w:color w:val="B7791F"/>
-                <w:sz w:val="19"/>
+                <w:color w:val="E2E8F0"/>
+                <w:sz w:val="20"/>
               </w:rPr>
               <w:br/>
-            </w:r>
-            <w:r>
-              <w:rPr>
-                <w:rFonts w:ascii="Calibri" w:hAnsi="Calibri"/>
-                <w:i/>
-                <w:color w:val="2D3748"/>
-                <w:sz w:val="18"/>
-              </w:rPr>
-              <w:t>This checklist confirms that all mandatory components of your application packet are attached. Check each box for the items included and sign at the bottom.</w:t>
+              <w:t>Resident Preparation Version — Use to Organize Items Required by Official Form B</w:t>
             </w:r>
           </w:p>
         </w:tc>
@@ -3997,7 +4063,7 @@
                 <w:color w:val="1A365D"/>
                 <w:sz w:val="18"/>
               </w:rPr>
-              <w:t>Submittal Fees on File:</w:t>
+              <w:t>Review Classification:</w:t>
             </w:r>
           </w:p>
         </w:tc>
@@ -4016,10 +4082,11 @@
             <w:r>
               <w:rPr>
                 <w:rFonts w:ascii="Calibri" w:hAnsi="Calibri"/>
-                <w:color w:val="2D3748"/>
+                <w:b/>
+                <w:color w:val="C53030"/>
                 <w:sz w:val="18"/>
               </w:rPr>
-              <w:t>Full Review ($200 Fee) + $250 Security Deposit Check</w:t>
+              <w:t>[ ] Exempt   [ ] Pre-Approved   [ ] Minor Review ($175)   [ ] Full Review ($200 + $250 Deposit)</w:t>
             </w:r>
           </w:p>
         </w:tc>
@@ -4057,7 +4124,7 @@
           <w:rFonts w:ascii="Calibri" w:hAnsi="Calibri"/>
           <w:sz w:val="18"/>
         </w:rPr>
-        <w:t>Included and fully executed</w:t>
+        <w:t>Included and executed</w:t>
       </w:r>
     </w:p>
     <w:p>
@@ -4078,7 +4145,7 @@
           <w:rFonts w:ascii="Calibri" w:hAnsi="Calibri"/>
           <w:sz w:val="18"/>
         </w:rPr>
-        <w:t>Updated with complete architectural and landscape scope (CHECKED)</w:t>
+        <w:t>Updated with project scope</w:t>
       </w:r>
     </w:p>
     <w:p>
@@ -4099,7 +4166,7 @@
           <w:rFonts w:ascii="Calibri" w:hAnsi="Calibri"/>
           <w:sz w:val="18"/>
         </w:rPr>
-        <w:t>Included at 1/8" = 1'-0" with lot lines, setbacks &amp; easements</w:t>
+        <w:t>Included at legible scale showing lot lines, setbacks &amp; drainage</w:t>
       </w:r>
     </w:p>
     <w:p>
@@ -4120,7 +4187,7 @@
           <w:rFonts w:ascii="Calibri" w:hAnsi="Calibri"/>
           <w:sz w:val="18"/>
         </w:rPr>
-        <w:t>Signed and acknowledged homeowner agreement attached</w:t>
+        <w:t>Signed homeowner agreement attached</w:t>
       </w:r>
     </w:p>
     <w:p>
@@ -4134,7 +4201,7 @@
           <w:color w:val="2B6CB0"/>
           <w:sz w:val="19"/>
         </w:rPr>
-        <w:t>PART II — LANDSCAPE AND HARDSCAPE IMPROVEMENTS:</w:t>
+        <w:t>PART II — SUPPORTING DOCUMENTS (Check All Applicable to Project):</w:t>
       </w:r>
     </w:p>
     <w:p>
@@ -4148,14 +4215,14 @@
           <w:b/>
           <w:sz w:val="18"/>
         </w:rPr>
-        <w:t xml:space="preserve">☑ Site Color Photos (Exhibit F) — </w:t>
+        <w:t xml:space="preserve">☐ Existing Site Photographs (Exhibit F) — </w:t>
       </w:r>
       <w:r>
         <w:rPr>
           <w:rFonts w:ascii="Calibri" w:hAnsi="Calibri"/>
           <w:sz w:val="18"/>
         </w:rPr>
-        <w:t>Front yard, left side yard, right side yard, and entire backyard</w:t>
+        <w:t>Color photos showing relevant site and surrounding conditions</w:t>
       </w:r>
     </w:p>
     <w:p>
@@ -4169,14 +4236,14 @@
           <w:b/>
           <w:sz w:val="18"/>
         </w:rPr>
-        <w:t xml:space="preserve">☑ Landscape &amp; Hardscape Construction Plan (Exhibit E) — </w:t>
+        <w:t xml:space="preserve">☐ Landscape &amp; Hardscape Layout Plan (Exhibit E) — </w:t>
       </w:r>
       <w:r>
         <w:rPr>
           <w:rFonts w:ascii="Calibri" w:hAnsi="Calibri"/>
           <w:sz w:val="18"/>
         </w:rPr>
-        <w:t>Full dimensioned layout showing proposed hardscape, setbacks &amp; drainage</w:t>
+        <w:t>Dimensioned layout showing proposed improvements, setbacks &amp; drainage</w:t>
       </w:r>
     </w:p>
     <w:p>
@@ -4190,14 +4257,14 @@
           <w:b/>
           <w:sz w:val="18"/>
         </w:rPr>
-        <w:t xml:space="preserve">☑ Grading and Drainage Plan — </w:t>
+        <w:t xml:space="preserve">☐ Grading &amp; Drainage Plan / Details — </w:t>
       </w:r>
       <w:r>
         <w:rPr>
           <w:rFonts w:ascii="Calibri" w:hAnsi="Calibri"/>
           <w:sz w:val="18"/>
         </w:rPr>
-        <w:t>1% hardscape / 2% softscape positive slopes with tie-in to builder storm collector</w:t>
+        <w:t>1% hardscape / 2% landscape slopes with tie-in to Declarant storm system</w:t>
       </w:r>
     </w:p>
     <w:p>
@@ -4211,14 +4278,14 @@
           <w:b/>
           <w:sz w:val="18"/>
         </w:rPr>
-        <w:t xml:space="preserve">☑ Irrigation Plan — </w:t>
+        <w:t xml:space="preserve">☐ Irrigation Plan — </w:t>
       </w:r>
       <w:r>
         <w:rPr>
           <w:rFonts w:ascii="Calibri" w:hAnsi="Calibri"/>
           <w:sz w:val="18"/>
         </w:rPr>
-        <w:t>Subterranean drip lines, dedicated shutoff valves, and spray/emitter zones</w:t>
+        <w:t>Subterranean drip lines, dedicated shutoff valves, and emitter zones</w:t>
       </w:r>
     </w:p>
     <w:p>
@@ -4232,14 +4299,14 @@
           <w:b/>
           <w:sz w:val="18"/>
         </w:rPr>
-        <w:t xml:space="preserve">☑ Planting Plan &amp; Plant Schedule — </w:t>
+        <w:t xml:space="preserve">☐ Planting Plan &amp; Schedule — </w:t>
       </w:r>
       <w:r>
         <w:rPr>
           <w:rFonts w:ascii="Calibri" w:hAnsi="Calibri"/>
           <w:sz w:val="18"/>
         </w:rPr>
-        <w:t>Botanical &amp; common names, container sizes, mature heights, and 5'-0" fence setbacks</w:t>
+        <w:t>Botanical &amp; common names, container sizes, mature heights, and setbacks</w:t>
       </w:r>
     </w:p>
     <w:p>
@@ -4253,7 +4320,7 @@
           <w:b/>
           <w:sz w:val="18"/>
         </w:rPr>
-        <w:t xml:space="preserve">☑ Landscape Lighting Plan — </w:t>
+        <w:t xml:space="preserve">☐ Landscape Lighting Plan — </w:t>
       </w:r>
       <w:r>
         <w:rPr>
@@ -4274,14 +4341,14 @@
           <w:b/>
           <w:sz w:val="18"/>
         </w:rPr>
-        <w:t xml:space="preserve">☑ Finish and Materials Schedule — </w:t>
+        <w:t xml:space="preserve">☐ Product Cut Sheets &amp; Material Samples (Exhibit G) — </w:t>
       </w:r>
       <w:r>
         <w:rPr>
           <w:rFonts w:ascii="Calibri" w:hAnsi="Calibri"/>
           <w:sz w:val="18"/>
         </w:rPr>
-        <w:t>Neutral stone veneer/stucco, broom concrete, non-combustible aluminum specs</w:t>
+        <w:t>Visual cuts, photos, or swatches for proposed products where applicable</w:t>
       </w:r>
     </w:p>
     <w:p>
@@ -4295,14 +4362,14 @@
           <w:b/>
           <w:sz w:val="18"/>
         </w:rPr>
-        <w:t xml:space="preserve">☑ Product Cuts &amp; Material Samples (Exhibit G) — </w:t>
+        <w:t xml:space="preserve">☐ Structural / Engineering Documents — </w:t>
       </w:r>
       <w:r>
         <w:rPr>
           <w:rFonts w:ascii="Calibri" w:hAnsi="Calibri"/>
           <w:sz w:val="18"/>
         </w:rPr>
-        <w:t>Visual sample cuts provided for ALL proposed items per ARC mandate</w:t>
+        <w:t>Required for walls exceeding 24" or non-standard structures</w:t>
       </w:r>
     </w:p>
     <w:p>
@@ -4315,7 +4382,7 @@
           <w:i/>
           <w:sz w:val="18"/>
         </w:rPr>
-        <w:t>OWNER ACKNOWLEDGMENT &amp; AGREEMENT:</w:t>
+        <w:t>OWNER ACKNOWLEDGMENT &amp; CERTIFICATION:</w:t>
       </w:r>
       <w:r>
         <w:rPr>
@@ -4324,7 +4391,7 @@
           <w:sz w:val="18"/>
         </w:rPr>
         <w:br/>
-        <w:t>I (We) understand that no work shall commence until written approval is received. All work will adhere to approved plans, City of Tracy building codes, and Phase 2 Fire Protection Plan guidelines. Existing drainage patterns will not be altered to sheet-flow onto neighboring lots.</w:t>
+        <w:t>I (We) understand that no work shall commence until written approval is received. All work will adhere to approved plans, City of Tracy building codes, and applicable Fire Protection Plan guidelines. Established drainage patterns will not be altered to sheet-flow onto neighboring lots.</w:t>
       </w:r>
       <w:r>
         <w:rPr>
@@ -4418,69 +4485,17 @@
                 <w:color w:val="E2E8F0"/>
                 <w:sz w:val="20"/>
               </w:rPr>
-              <w:t>ARCHITECTURAL REVIEW REQUEST FORM</w:t>
-            </w:r>
-          </w:p>
-        </w:tc>
-      </w:tr>
-    </w:tbl>
-    <w:p>
-      <w:pPr>
-        <w:spacing w:after="80"/>
-      </w:pPr>
-    </w:p>
-    <w:tbl>
-      <w:tblPr>
-        <w:tblW w:w="0" w:type="auto"/>
-        <w:jc w:val="center"/>
-        <w:tblLayout w:type="fixed"/>
-        <w:tblLook w:val="04A0" w:firstRow="1" w:lastRow="0" w:firstColumn="1" w:lastColumn="0" w:noHBand="0" w:noVBand="1"/>
-      </w:tblPr>
-      <w:tblGrid>
-        <w:gridCol w:w="9936"/>
-      </w:tblGrid>
-      <w:tr>
-        <w:trPr>
-          <w:jc w:val="center"/>
-        </w:trPr>
-        <w:tc>
-          <w:tcPr>
-            <w:tcW w:w="9936" w:type="dxa"/>
-            <w:shd w:val="clear" w:color="auto" w:fill="FEFCBF"/>
-            <w:tcMar>
-              <w:top w:w="80" w:type="dxa"/>
-              <w:left w:w="120" w:type="dxa"/>
-              <w:bottom w:w="80" w:type="dxa"/>
-              <w:right w:w="120" w:type="dxa"/>
-            </w:tcMar>
-          </w:tcPr>
-          <w:p>
+              <w:t>DESIGN REVIEW REQUEST FORM</w:t>
+            </w:r>
             <w:r>
               <w:rPr>
                 <w:rFonts w:ascii="Calibri" w:hAnsi="Calibri"/>
                 <w:b/>
-                <w:color w:val="B7791F"/>
-                <w:sz w:val="19"/>
-              </w:rPr>
-              <w:t>💡 TIP / INSTRUCTION ONLY — FORM C INSTRUCTION</w:t>
-            </w:r>
-            <w:r>
-              <w:rPr>
-                <w:rFonts w:ascii="Calibri" w:hAnsi="Calibri"/>
-                <w:b/>
-                <w:color w:val="B7791F"/>
-                <w:sz w:val="19"/>
+                <w:color w:val="E2E8F0"/>
+                <w:sz w:val="20"/>
               </w:rPr>
               <w:br/>
-            </w:r>
-            <w:r>
-              <w:rPr>
-                <w:rFonts w:ascii="Calibri" w:hAnsi="Calibri"/>
-                <w:i/>
-                <w:color w:val="2D3748"/>
-                <w:sz w:val="18"/>
-              </w:rPr>
-              <w:t>This is the official request form submitted to Seabreeze Management. Verify your property address and contact details, adjust the modular scope numbers below for items you are installing, then sign at the bottom.</w:t>
+              <w:t>Resident Preparation Version — Organize Scope Required by Official Form C</w:t>
             </w:r>
           </w:p>
         </w:tc>
@@ -4729,7 +4744,7 @@
                 <w:color w:val="1A365D"/>
                 <w:sz w:val="18"/>
               </w:rPr>
-              <w:t>Type of Work (Checked):</w:t>
+              <w:t>Review Classification:</w:t>
             </w:r>
           </w:p>
         </w:tc>
@@ -4748,10 +4763,11 @@
             <w:r>
               <w:rPr>
                 <w:rFonts w:ascii="Calibri" w:hAnsi="Calibri"/>
-                <w:color w:val="2D3748"/>
+                <w:b/>
+                <w:color w:val="C53030"/>
                 <w:sz w:val="18"/>
               </w:rPr>
-              <w:t>☑ Architectural   ☑ Landscape   ☑ Hardscape   ☑ Patio Cover   ☑ Lighting   ☑ Water Feature</w:t>
+              <w:t>[ ] Exempt   [ ] Pre-Approved   [ ] Minor Review   [ ] Full Review</w:t>
             </w:r>
           </w:p>
         </w:tc>
@@ -4759,7 +4775,340 @@
     </w:tbl>
     <w:p>
       <w:pPr>
-        <w:spacing w:before="80"/>
+        <w:keepNext/>
+        <w:spacing w:before="240" w:after="80"/>
+      </w:pPr>
+      <w:r>
+        <w:rPr>
+          <w:rFonts w:ascii="Calibri" w:hAnsi="Calibri"/>
+          <w:b/>
+          <w:color w:val="1A365D"/>
+          <w:sz w:val="24"/>
+        </w:rPr>
+        <w:t>PROJECT INFORMATION BLOCK (CUSTOMIZE TO YOUR PROJECT)</w:t>
+      </w:r>
+    </w:p>
+    <w:tbl>
+      <w:tblPr>
+        <w:tblW w:w="0" w:type="auto"/>
+        <w:jc w:val="center"/>
+        <w:tblLayout w:type="fixed"/>
+        <w:tblLook w:val="04A0" w:firstRow="1" w:lastRow="0" w:firstColumn="1" w:lastColumn="0" w:noHBand="0" w:noVBand="1"/>
+      </w:tblPr>
+      <w:tblGrid>
+        <w:gridCol w:w="3168"/>
+        <w:gridCol w:w="6624"/>
+      </w:tblGrid>
+      <w:tr>
+        <w:trPr>
+          <w:jc w:val="center"/>
+        </w:trPr>
+        <w:tc>
+          <w:tcPr>
+            <w:tcW w:w="3168" w:type="dxa"/>
+            <w:shd w:val="clear" w:color="auto" w:fill="F7FAFC"/>
+            <w:tcMar>
+              <w:top w:w="45" w:type="dxa"/>
+              <w:left w:w="90" w:type="dxa"/>
+              <w:bottom w:w="45" w:type="dxa"/>
+              <w:right w:w="90" w:type="dxa"/>
+            </w:tcMar>
+          </w:tcPr>
+          <w:p>
+            <w:r>
+              <w:rPr>
+                <w:rFonts w:ascii="Calibri" w:hAnsi="Calibri"/>
+                <w:b/>
+                <w:color w:val="1A365D"/>
+                <w:sz w:val="17"/>
+              </w:rPr>
+              <w:t>Project Title / Summary:</w:t>
+            </w:r>
+          </w:p>
+        </w:tc>
+        <w:tc>
+          <w:tcPr>
+            <w:tcW w:w="6624" w:type="dxa"/>
+            <w:shd w:val="clear" w:color="auto" w:fill="FFFFFF"/>
+            <w:tcMar>
+              <w:top w:w="45" w:type="dxa"/>
+              <w:left w:w="90" w:type="dxa"/>
+              <w:bottom w:w="45" w:type="dxa"/>
+              <w:right w:w="90" w:type="dxa"/>
+            </w:tcMar>
+          </w:tcPr>
+          <w:p>
+            <w:r>
+              <w:rPr>
+                <w:rFonts w:ascii="Calibri" w:hAnsi="Calibri"/>
+                <w:b/>
+                <w:color w:val="C53030"/>
+                <w:sz w:val="17"/>
+              </w:rPr>
+              <w:t>[✏️ e.g., Rear Yard Landscape &amp; Aluminum Patio Cover Installation]</w:t>
+            </w:r>
+          </w:p>
+        </w:tc>
+      </w:tr>
+      <w:tr>
+        <w:trPr>
+          <w:jc w:val="center"/>
+        </w:trPr>
+        <w:tc>
+          <w:tcPr>
+            <w:tcW w:w="3168" w:type="dxa"/>
+            <w:shd w:val="clear" w:color="auto" w:fill="F7FAFC"/>
+            <w:tcMar>
+              <w:top w:w="45" w:type="dxa"/>
+              <w:left w:w="90" w:type="dxa"/>
+              <w:bottom w:w="45" w:type="dxa"/>
+              <w:right w:w="90" w:type="dxa"/>
+            </w:tcMar>
+          </w:tcPr>
+          <w:p>
+            <w:r>
+              <w:rPr>
+                <w:rFonts w:ascii="Calibri" w:hAnsi="Calibri"/>
+                <w:b/>
+                <w:color w:val="1A365D"/>
+                <w:sz w:val="17"/>
+              </w:rPr>
+              <w:t>Location on Lot:</w:t>
+            </w:r>
+          </w:p>
+        </w:tc>
+        <w:tc>
+          <w:tcPr>
+            <w:tcW w:w="6624" w:type="dxa"/>
+            <w:shd w:val="clear" w:color="auto" w:fill="FFFFFF"/>
+            <w:tcMar>
+              <w:top w:w="45" w:type="dxa"/>
+              <w:left w:w="90" w:type="dxa"/>
+              <w:bottom w:w="45" w:type="dxa"/>
+              <w:right w:w="90" w:type="dxa"/>
+            </w:tcMar>
+          </w:tcPr>
+          <w:p>
+            <w:r>
+              <w:rPr>
+                <w:rFonts w:ascii="Calibri" w:hAnsi="Calibri"/>
+                <w:b/>
+                <w:color w:val="C53030"/>
+                <w:sz w:val="17"/>
+              </w:rPr>
+              <w:t>[✏️ Rear yard, left side yard, right side yard, etc.]</w:t>
+            </w:r>
+          </w:p>
+        </w:tc>
+      </w:tr>
+      <w:tr>
+        <w:trPr>
+          <w:jc w:val="center"/>
+        </w:trPr>
+        <w:tc>
+          <w:tcPr>
+            <w:tcW w:w="3168" w:type="dxa"/>
+            <w:shd w:val="clear" w:color="auto" w:fill="F7FAFC"/>
+            <w:tcMar>
+              <w:top w:w="45" w:type="dxa"/>
+              <w:left w:w="90" w:type="dxa"/>
+              <w:bottom w:w="45" w:type="dxa"/>
+              <w:right w:w="90" w:type="dxa"/>
+            </w:tcMar>
+          </w:tcPr>
+          <w:p>
+            <w:r>
+              <w:rPr>
+                <w:rFonts w:ascii="Calibri" w:hAnsi="Calibri"/>
+                <w:b/>
+                <w:color w:val="1A365D"/>
+                <w:sz w:val="17"/>
+              </w:rPr>
+              <w:t>Overall Dimensions &amp; Height:</w:t>
+            </w:r>
+          </w:p>
+        </w:tc>
+        <w:tc>
+          <w:tcPr>
+            <w:tcW w:w="6624" w:type="dxa"/>
+            <w:shd w:val="clear" w:color="auto" w:fill="FFFFFF"/>
+            <w:tcMar>
+              <w:top w:w="45" w:type="dxa"/>
+              <w:left w:w="90" w:type="dxa"/>
+              <w:bottom w:w="45" w:type="dxa"/>
+              <w:right w:w="90" w:type="dxa"/>
+            </w:tcMar>
+          </w:tcPr>
+          <w:p>
+            <w:r>
+              <w:rPr>
+                <w:rFonts w:ascii="Calibri" w:hAnsi="Calibri"/>
+                <w:b/>
+                <w:color w:val="C53030"/>
+                <w:sz w:val="17"/>
+              </w:rPr>
+              <w:t>[✏️ Dimensions (L x W x H) for proposed structures/walls]</w:t>
+            </w:r>
+          </w:p>
+        </w:tc>
+      </w:tr>
+      <w:tr>
+        <w:trPr>
+          <w:jc w:val="center"/>
+        </w:trPr>
+        <w:tc>
+          <w:tcPr>
+            <w:tcW w:w="3168" w:type="dxa"/>
+            <w:shd w:val="clear" w:color="auto" w:fill="F7FAFC"/>
+            <w:tcMar>
+              <w:top w:w="45" w:type="dxa"/>
+              <w:left w:w="90" w:type="dxa"/>
+              <w:bottom w:w="45" w:type="dxa"/>
+              <w:right w:w="90" w:type="dxa"/>
+            </w:tcMar>
+          </w:tcPr>
+          <w:p>
+            <w:r>
+              <w:rPr>
+                <w:rFonts w:ascii="Calibri" w:hAnsi="Calibri"/>
+                <w:b/>
+                <w:color w:val="1A365D"/>
+                <w:sz w:val="17"/>
+              </w:rPr>
+              <w:t>Proposed Setbacks:</w:t>
+            </w:r>
+          </w:p>
+        </w:tc>
+        <w:tc>
+          <w:tcPr>
+            <w:tcW w:w="6624" w:type="dxa"/>
+            <w:shd w:val="clear" w:color="auto" w:fill="FFFFFF"/>
+            <w:tcMar>
+              <w:top w:w="45" w:type="dxa"/>
+              <w:left w:w="90" w:type="dxa"/>
+              <w:bottom w:w="45" w:type="dxa"/>
+              <w:right w:w="90" w:type="dxa"/>
+            </w:tcMar>
+          </w:tcPr>
+          <w:p>
+            <w:r>
+              <w:rPr>
+                <w:rFonts w:ascii="Calibri" w:hAnsi="Calibri"/>
+                <w:b/>
+                <w:color w:val="C53030"/>
+                <w:sz w:val="17"/>
+              </w:rPr>
+              <w:t>[✏️ Rear setback __'-0", Left side setback __'-0", Right side __'-0"]</w:t>
+            </w:r>
+          </w:p>
+        </w:tc>
+      </w:tr>
+      <w:tr>
+        <w:trPr>
+          <w:jc w:val="center"/>
+        </w:trPr>
+        <w:tc>
+          <w:tcPr>
+            <w:tcW w:w="3168" w:type="dxa"/>
+            <w:shd w:val="clear" w:color="auto" w:fill="F7FAFC"/>
+            <w:tcMar>
+              <w:top w:w="45" w:type="dxa"/>
+              <w:left w:w="90" w:type="dxa"/>
+              <w:bottom w:w="45" w:type="dxa"/>
+              <w:right w:w="90" w:type="dxa"/>
+            </w:tcMar>
+          </w:tcPr>
+          <w:p>
+            <w:r>
+              <w:rPr>
+                <w:rFonts w:ascii="Calibri" w:hAnsi="Calibri"/>
+                <w:b/>
+                <w:color w:val="1A365D"/>
+                <w:sz w:val="17"/>
+              </w:rPr>
+              <w:t>Materials &amp; Finishes:</w:t>
+            </w:r>
+          </w:p>
+        </w:tc>
+        <w:tc>
+          <w:tcPr>
+            <w:tcW w:w="6624" w:type="dxa"/>
+            <w:shd w:val="clear" w:color="auto" w:fill="FFFFFF"/>
+            <w:tcMar>
+              <w:top w:w="45" w:type="dxa"/>
+              <w:left w:w="90" w:type="dxa"/>
+              <w:bottom w:w="45" w:type="dxa"/>
+              <w:right w:w="90" w:type="dxa"/>
+            </w:tcMar>
+          </w:tcPr>
+          <w:p>
+            <w:r>
+              <w:rPr>
+                <w:rFonts w:ascii="Calibri" w:hAnsi="Calibri"/>
+                <w:b/>
+                <w:color w:val="C53030"/>
+                <w:sz w:val="17"/>
+              </w:rPr>
+              <w:t>[✏️ Extruded aluminum, stacked stone ledger, broom concrete, etc.]</w:t>
+            </w:r>
+          </w:p>
+        </w:tc>
+      </w:tr>
+      <w:tr>
+        <w:trPr>
+          <w:jc w:val="center"/>
+        </w:trPr>
+        <w:tc>
+          <w:tcPr>
+            <w:tcW w:w="3168" w:type="dxa"/>
+            <w:shd w:val="clear" w:color="auto" w:fill="F7FAFC"/>
+            <w:tcMar>
+              <w:top w:w="45" w:type="dxa"/>
+              <w:left w:w="90" w:type="dxa"/>
+              <w:bottom w:w="45" w:type="dxa"/>
+              <w:right w:w="90" w:type="dxa"/>
+            </w:tcMar>
+          </w:tcPr>
+          <w:p>
+            <w:r>
+              <w:rPr>
+                <w:rFonts w:ascii="Calibri" w:hAnsi="Calibri"/>
+                <w:b/>
+                <w:color w:val="1A365D"/>
+                <w:sz w:val="17"/>
+              </w:rPr>
+              <w:t>Estimated Schedule:</w:t>
+            </w:r>
+          </w:p>
+        </w:tc>
+        <w:tc>
+          <w:tcPr>
+            <w:tcW w:w="6624" w:type="dxa"/>
+            <w:shd w:val="clear" w:color="auto" w:fill="FFFFFF"/>
+            <w:tcMar>
+              <w:top w:w="45" w:type="dxa"/>
+              <w:left w:w="90" w:type="dxa"/>
+              <w:bottom w:w="45" w:type="dxa"/>
+              <w:right w:w="90" w:type="dxa"/>
+            </w:tcMar>
+          </w:tcPr>
+          <w:p>
+            <w:r>
+              <w:rPr>
+                <w:rFonts w:ascii="Calibri" w:hAnsi="Calibri"/>
+                <w:b/>
+                <w:color w:val="C53030"/>
+                <w:sz w:val="17"/>
+              </w:rPr>
+              <w:t>[✏️ Start Date: _________ | Estimated Completion: _________]</w:t>
+            </w:r>
+          </w:p>
+        </w:tc>
+      </w:tr>
+    </w:tbl>
+    <w:p>
+      <w:pPr>
+        <w:spacing w:before="120"/>
       </w:pPr>
       <w:r>
         <w:rPr>
@@ -4768,7 +5117,7 @@
           <w:color w:val="2B6CB0"/>
           <w:sz w:val="19"/>
         </w:rPr>
-        <w:t>DETAILED SCOPE OF PROPOSED WORK (MODULAR MENU — CUSTOMIZE TO YOUR LOT):</w:t>
+        <w:t>DETAILED SCOPE OF PROPOSED WORK (MODULAR MENU — SELECT APPLICABLE ITEMS):</w:t>
       </w:r>
     </w:p>
     <w:p>
@@ -4781,7 +5130,7 @@
           <w:color w:val="2D3748"/>
           <w:sz w:val="17"/>
         </w:rPr>
-        <w:t>1. Patio Cover / Pergola: [Select / Delete if not installing] Heavy-gauge extruded aluminum structure, powder-coated in earth-tone finish (100% non-combustible per CBC Chapter 7A / FPP Appendix B). Size: [✏️ Specify: e.g., __' W x __' L x __' H], set back [✏️ Specify: e.g., __'-0"] from rear fence and [✏️ Specify: e.g., __'-0"] from side fence.</w:t>
+        <w:t>1. Patio Cover / Pergola: [Select / Delete if not installing] Heavy-gauge extruded aluminum structure (or assembly complying with FPP Appendix B / CBC Chapter 7A). Size: [✏️ Specify: e.g., __' W x __' L x __' H], set back [✏️ Specify: e.g., __'-0"] from rear fence and [✏️ Specify: e.g., __'-0"] from side fence.</w:t>
       </w:r>
       <w:r>
         <w:rPr>
@@ -4799,7 +5148,7 @@
           <w:sz w:val="17"/>
         </w:rPr>
         <w:br/>
-        <w:t>3. Retaining Wall / Terrace Curb: [Select / Delete if not installing] Maximum [✏️ Specify: e.g., 18", 20", or 24"] height from finished grade (≤ 24" HOA limit), faced with natural stacked stone veneer, brick, or stucco with solid cap, sealed with Thoroseal waterproofing and perforated sub-drain connected to builder storm pipe.</w:t>
+        <w:t>3. Retaining Wall / Terrace Curb: [Select / Delete if not installing] Maximum [✏️ Specify: e.g., 18", 20", or 24"] height from finished grade (≤ 24" HOA limit per V12 §IV.B.5.i), faced with natural stone veneer, brick, or stucco with solid cap. Retaining walls are not located adjacent to existing Residence.</w:t>
       </w:r>
       <w:r>
         <w:rPr>
@@ -4817,7 +5166,7 @@
           <w:sz w:val="17"/>
         </w:rPr>
         <w:br/>
-        <w:t>5. Outdoor Gas Fire Pit / Fireplace: [Select / Delete if not installing] Natural gas with electronic starter (no wood-burning units allowed).</w:t>
+        <w:t>5. Outdoor Gas Fire Pit / Fireplace: [Select / Delete if not installing] Natural gas with electronic starter (no wood-burning units allowed per V12 §IV.B.9.d).</w:t>
       </w:r>
       <w:r>
         <w:rPr>
@@ -4844,7 +5193,7 @@
           <w:sz w:val="17"/>
         </w:rPr>
         <w:br/>
-        <w:t>8. Raised Garden / Planter Beds: [Select / Delete if not installing] Modular raised planter boxes constructed of exterior fire-retardant treated wood or composite/metal.</w:t>
+        <w:t>8. Raised Garden / Planter Beds: [Select / Delete if not installing] Modular planter boxes constructed of exterior fire-retardant treated wood or composite/metal.</w:t>
       </w:r>
       <w:r>
         <w:rPr>
@@ -4853,7 +5202,16 @@
           <w:sz w:val="17"/>
         </w:rPr>
         <w:br/>
-        <w:t>9. Storage Shed: [Select / Delete if not installing] Low-profile weather-resistant resin or metal shed placed on concrete pad in private yard below 6'-0" fence line.</w:t>
+        <w:t xml:space="preserve">9. Storage Shed: [Select / Delete if not installing] Low-profile weather-resistant resin or metal shed placed on concrete pad in private yard </w:t>
+      </w:r>
+      <w:r>
+        <w:rPr>
+          <w:rFonts w:ascii="Calibri" w:hAnsi="Calibri"/>
+          <w:color w:val="2D3748"/>
+          <w:sz w:val="17"/>
+        </w:rPr>
+        <w:lastRenderedPageBreak/>
+        <w:t>below 6'-0" fence line.</w:t>
       </w:r>
       <w:r>
         <w:rPr>
@@ -4889,7 +5247,7 @@
           <w:sz w:val="17"/>
         </w:rPr>
         <w:br/>
-        <w:t>13. Turf Options: [Select: Class A fire-rated synthetic grass with 10-yr warranty over 3" aggregate base OR drought-tolerant dwarf fescue sod].</w:t>
+        <w:t>13. Turf Options: [Select: Synthetic grass (Class A Fire Rated, 10-yr warranty) OR drought-tolerant dwarf fescue sod].</w:t>
       </w:r>
       <w:r>
         <w:rPr>
@@ -4898,7 +5256,7 @@
           <w:sz w:val="17"/>
         </w:rPr>
         <w:br/>
-        <w:t>14. Trees &amp; Plants: 100% non-pyrophytic species all set back &gt;= 5'-0" from fence lines with root barriers.</w:t>
+        <w:t>14. Trees &amp; Plants: Non-pyrophytic species complying with FPP Appendix A. Proposed trees should be kept at least 5'-0" from property lines/fences, with root barriers within 5'-0" of walls/adjoining residences.</w:t>
       </w:r>
     </w:p>
     <w:p>
@@ -4937,12 +5295,11 @@
           <w:sz w:val="17"/>
         </w:rPr>
         <w:br/>
-        <w:t>Management Company: Seabreeze Management Company, 4305 Hacienda Dr., Suite 350, Pleasanton, CA 94588 (Email: csteam@seabreezemgmt.com)</w:t>
+        <w:t>Management Company Reference: Seabreeze Management Company (Email: csteam@seabreezemgmt.com)</w:t>
       </w:r>
     </w:p>
     <w:p>
       <w:r>
-        <w:lastRenderedPageBreak/>
         <w:br w:type="page"/>
       </w:r>
     </w:p>
@@ -4998,6 +5355,16 @@
                 <w:sz w:val="20"/>
               </w:rPr>
               <w:t>NEIGHBOR NOTIFICATION FORM</w:t>
+            </w:r>
+            <w:r>
+              <w:rPr>
+                <w:rFonts w:ascii="Calibri" w:hAnsi="Calibri"/>
+                <w:b/>
+                <w:color w:val="E2E8F0"/>
+                <w:sz w:val="20"/>
+              </w:rPr>
+              <w:br/>
+              <w:t>Resident Preparation Version — Organize Signatures Required by Official Form D</w:t>
             </w:r>
           </w:p>
         </w:tc>
@@ -5059,7 +5426,7 @@
                 <w:color w:val="2D3748"/>
                 <w:sz w:val="18"/>
               </w:rPr>
-              <w:t>1. Show your 2D plan drawings to your immediate neighbors.</w:t>
+              <w:t>1. Show your plan drawings to the properties required by current Association rules (typically immediate adjacent neighbors, rear property line neighbors, and facing properties).</w:t>
             </w:r>
             <w:r>
               <w:rPr>
@@ -5069,7 +5436,7 @@
                 <w:sz w:val="18"/>
               </w:rPr>
               <w:br/>
-              <w:t>2. ADJACENT: Neighbors sharing your left and right side fences.</w:t>
+              <w:t>2. Neighbor signature verifies NOTIFICATION ONLY, not permission or project approval. A neighbor cannot veto an application.</w:t>
             </w:r>
             <w:r>
               <w:rPr>
@@ -5079,27 +5446,7 @@
                 <w:sz w:val="18"/>
               </w:rPr>
               <w:br/>
-              <w:t>3. REAR: Neighbors sharing your back property line.</w:t>
-            </w:r>
-            <w:r>
-              <w:rPr>
-                <w:rFonts w:ascii="Calibri" w:hAnsi="Calibri"/>
-                <w:i/>
-                <w:color w:val="2D3748"/>
-                <w:sz w:val="18"/>
-              </w:rPr>
-              <w:br/>
-              <w:t>4. FACING: The 3 neighbor properties across the street from your front yard.</w:t>
-            </w:r>
-            <w:r>
-              <w:rPr>
-                <w:rFonts w:ascii="Calibri" w:hAnsi="Calibri"/>
-                <w:i/>
-                <w:color w:val="2D3748"/>
-                <w:sz w:val="18"/>
-              </w:rPr>
-              <w:br/>
-              <w:t>5. Neighbor signature ONLY acknowledges notification — it does NOT mean approval or disapproval.</w:t>
+              <w:t>3. If a lot is vacant, under construction, or builder-owned, document the status on the line (e.g., 'Builder / Vacant Lot').</w:t>
             </w:r>
           </w:p>
         </w:tc>
@@ -5116,7 +5463,7 @@
           <w:rFonts w:ascii="Calibri" w:hAnsi="Calibri"/>
           <w:sz w:val="18"/>
         </w:rPr>
-        <w:t xml:space="preserve">The undersigned neighbors have reviewed the proposed architectural and landscape improvement plans for </w:t>
+        <w:t xml:space="preserve">The undersigned neighbors have reviewed the proposed improvement plans for </w:t>
       </w:r>
       <w:r>
         <w:rPr>
@@ -5270,10 +5617,10 @@
               <w:rPr>
                 <w:rFonts w:ascii="Calibri" w:hAnsi="Calibri"/>
                 <w:b/>
-                <w:color w:val="1A365D"/>
-                <w:sz w:val="17"/>
-              </w:rPr>
-              <w:t>Left Adjacent Neighbor</w:t>
+                <w:color w:val="C53030"/>
+                <w:sz w:val="17"/>
+              </w:rPr>
+              <w:t>[✏️ Left Adjacent Neighbor]</w:t>
             </w:r>
           </w:p>
         </w:tc>
@@ -5296,7 +5643,7 @@
                 <w:color w:val="C53030"/>
                 <w:sz w:val="17"/>
               </w:rPr>
-              <w:t>[Left Neighbor Street Address / Lot #]</w:t>
+              <w:t>[Property Address / Lot #]</w:t>
             </w:r>
           </w:p>
         </w:tc>
@@ -5366,10 +5713,10 @@
               <w:rPr>
                 <w:rFonts w:ascii="Calibri" w:hAnsi="Calibri"/>
                 <w:b/>
-                <w:color w:val="1A365D"/>
-                <w:sz w:val="17"/>
-              </w:rPr>
-              <w:t>Right Adjacent Neighbor</w:t>
+                <w:color w:val="C53030"/>
+                <w:sz w:val="17"/>
+              </w:rPr>
+              <w:t>[✏️ Right Adjacent Neighbor]</w:t>
             </w:r>
           </w:p>
         </w:tc>
@@ -5392,7 +5739,7 @@
                 <w:color w:val="C53030"/>
                 <w:sz w:val="17"/>
               </w:rPr>
-              <w:t>[Right Neighbor Street Address / Lot #]</w:t>
+              <w:t>[Property Address / Lot #]</w:t>
             </w:r>
           </w:p>
         </w:tc>
@@ -5462,10 +5809,10 @@
               <w:rPr>
                 <w:rFonts w:ascii="Calibri" w:hAnsi="Calibri"/>
                 <w:b/>
-                <w:color w:val="1A365D"/>
-                <w:sz w:val="17"/>
-              </w:rPr>
-              <w:t>Rear Neighbor (Left)</w:t>
+                <w:color w:val="C53030"/>
+                <w:sz w:val="17"/>
+              </w:rPr>
+              <w:t>[✏️ Rear Neighbor #1]</w:t>
             </w:r>
           </w:p>
         </w:tc>
@@ -5488,7 +5835,7 @@
                 <w:color w:val="C53030"/>
                 <w:sz w:val="17"/>
               </w:rPr>
-              <w:t>[Rear Left Property Address / Lot #]</w:t>
+              <w:t>[Property Address / Lot #]</w:t>
             </w:r>
           </w:p>
         </w:tc>
@@ -5558,10 +5905,10 @@
               <w:rPr>
                 <w:rFonts w:ascii="Calibri" w:hAnsi="Calibri"/>
                 <w:b/>
-                <w:color w:val="1A365D"/>
-                <w:sz w:val="17"/>
-              </w:rPr>
-              <w:t>Rear Neighbor (Center)</w:t>
+                <w:color w:val="C53030"/>
+                <w:sz w:val="17"/>
+              </w:rPr>
+              <w:t>[✏️ Rear Neighbor #2]</w:t>
             </w:r>
           </w:p>
         </w:tc>
@@ -5584,7 +5931,7 @@
                 <w:color w:val="C53030"/>
                 <w:sz w:val="17"/>
               </w:rPr>
-              <w:t>[Rear Center Property Address / Lot #]</w:t>
+              <w:t>[Property Address / Lot #]</w:t>
             </w:r>
           </w:p>
         </w:tc>
@@ -5654,10 +6001,10 @@
               <w:rPr>
                 <w:rFonts w:ascii="Calibri" w:hAnsi="Calibri"/>
                 <w:b/>
-                <w:color w:val="1A365D"/>
-                <w:sz w:val="17"/>
-              </w:rPr>
-              <w:t>Facing Neighbor #1</w:t>
+                <w:color w:val="C53030"/>
+                <w:sz w:val="17"/>
+              </w:rPr>
+              <w:t>[✏️ Facing Neighbor #1]</w:t>
             </w:r>
           </w:p>
         </w:tc>
@@ -5680,7 +6027,7 @@
                 <w:color w:val="C53030"/>
                 <w:sz w:val="17"/>
               </w:rPr>
-              <w:t>[Facing Neighbor #1 Street Address]</w:t>
+              <w:t>[Property Address / Lot #]</w:t>
             </w:r>
           </w:p>
         </w:tc>
@@ -5750,10 +6097,10 @@
               <w:rPr>
                 <w:rFonts w:ascii="Calibri" w:hAnsi="Calibri"/>
                 <w:b/>
-                <w:color w:val="1A365D"/>
-                <w:sz w:val="17"/>
-              </w:rPr>
-              <w:t>Facing Neighbor #2</w:t>
+                <w:color w:val="C53030"/>
+                <w:sz w:val="17"/>
+              </w:rPr>
+              <w:t>[✏️ Facing Neighbor #2]</w:t>
             </w:r>
           </w:p>
         </w:tc>
@@ -5776,7 +6123,7 @@
                 <w:color w:val="C53030"/>
                 <w:sz w:val="17"/>
               </w:rPr>
-              <w:t>[Facing Neighbor #2 Street Address]</w:t>
+              <w:t>[Property Address / Lot #]</w:t>
             </w:r>
           </w:p>
         </w:tc>
@@ -5885,67 +6232,15 @@
               </w:rPr>
               <w:t>WATER QUALITY MANAGEMENT BEST MANAGEMENT PRACTICE (BMP) GUIDELINES</w:t>
             </w:r>
-          </w:p>
-        </w:tc>
-      </w:tr>
-    </w:tbl>
-    <w:p>
-      <w:pPr>
-        <w:spacing w:after="80"/>
-      </w:pPr>
-    </w:p>
-    <w:tbl>
-      <w:tblPr>
-        <w:tblW w:w="0" w:type="auto"/>
-        <w:jc w:val="center"/>
-        <w:tblLayout w:type="fixed"/>
-        <w:tblLook w:val="04A0" w:firstRow="1" w:lastRow="0" w:firstColumn="1" w:lastColumn="0" w:noHBand="0" w:noVBand="1"/>
-      </w:tblPr>
-      <w:tblGrid>
-        <w:gridCol w:w="9936"/>
-      </w:tblGrid>
-      <w:tr>
-        <w:trPr>
-          <w:jc w:val="center"/>
-        </w:trPr>
-        <w:tc>
-          <w:tcPr>
-            <w:tcW w:w="9936" w:type="dxa"/>
-            <w:shd w:val="clear" w:color="auto" w:fill="FEFCBF"/>
-            <w:tcMar>
-              <w:top w:w="80" w:type="dxa"/>
-              <w:left w:w="120" w:type="dxa"/>
-              <w:bottom w:w="80" w:type="dxa"/>
-              <w:right w:w="120" w:type="dxa"/>
-            </w:tcMar>
-          </w:tcPr>
-          <w:p>
             <w:r>
               <w:rPr>
                 <w:rFonts w:ascii="Calibri" w:hAnsi="Calibri"/>
                 <w:b/>
-                <w:color w:val="B7791F"/>
-                <w:sz w:val="19"/>
-              </w:rPr>
-              <w:t>💡 TIP / INSTRUCTION ONLY — FORM G WATER QUALITY TIP</w:t>
-            </w:r>
-            <w:r>
-              <w:rPr>
-                <w:rFonts w:ascii="Calibri" w:hAnsi="Calibri"/>
-                <w:b/>
-                <w:color w:val="B7791F"/>
-                <w:sz w:val="19"/>
+                <w:color w:val="E2E8F0"/>
+                <w:sz w:val="20"/>
               </w:rPr>
               <w:br/>
-            </w:r>
-            <w:r>
-              <w:rPr>
-                <w:rFonts w:ascii="Calibri" w:hAnsi="Calibri"/>
-                <w:i/>
-                <w:color w:val="2D3748"/>
-                <w:sz w:val="18"/>
-              </w:rPr>
-              <w:t>This mandatory California Water Quality Board compliance document must be signed by the homeowner. It ensures no construction runoff, chemicals, or silt enter street gutters or city storm drains.</w:t>
+              <w:t>Homeowner Compliance Agreement</w:t>
             </w:r>
           </w:p>
         </w:tc>
@@ -6023,7 +6318,7 @@
           <w:color w:val="2D3748"/>
           <w:sz w:val="18"/>
         </w:rPr>
-        <w:t>5. Positive drainage away from residence foundations (1% hardscape / 2% landscape) must connect to builder-installed PVC collector system.</w:t>
+        <w:t>5. Positive drainage away from residence foundations (1% hardscape / 2% landscape) must connect to existing Declarant system where required.</w:t>
       </w:r>
     </w:p>
     <w:p>
@@ -6187,7 +6482,7 @@
                 <w:color w:val="E2E8F0"/>
                 <w:sz w:val="20"/>
               </w:rPr>
-              <w:t>SHEET L-1 &amp; SHEET L-2 PLAN PLACEHOLDERS</w:t>
+              <w:t>PLAN DRAWING PLACEHOLDERS</w:t>
             </w:r>
           </w:p>
         </w:tc>
@@ -6231,7 +6526,7 @@
                 <w:color w:val="B7791F"/>
                 <w:sz w:val="19"/>
               </w:rPr>
-              <w:t>💡 TIP / INSTRUCTION ONLY — PLAN DRAWING TIPS</w:t>
+              <w:t>💡 TIP / INSTRUCTION ONLY — PLAN DRAWING GUIDANCE</w:t>
             </w:r>
             <w:r>
               <w:rPr>
@@ -6249,7 +6544,7 @@
                 <w:color w:val="2D3748"/>
                 <w:sz w:val="18"/>
               </w:rPr>
-              <w:t>• Every drawing sheet MUST display: Homeowner Name, Address, Lot Number, Scale (1/8" = 1'-0"), and a North Arrow.</w:t>
+              <w:t>• Every drawing sheet should display: Homeowner Name, Address, Lot Number, Scale [Insert Appropriate Scale], and a North Arrow.</w:t>
             </w:r>
             <w:r>
               <w:rPr>
@@ -6269,7 +6564,7 @@
                 <w:sz w:val="18"/>
               </w:rPr>
               <w:br/>
-              <w:t>• Show drainage flow arrows pointing to catch basins connected to the builder's main storm drain lines.</w:t>
+              <w:t>• Show drainage flow arrows pointing away from structures towards catch basins or swales.</w:t>
             </w:r>
           </w:p>
         </w:tc>
@@ -6341,7 +6636,7 @@
                 <w:color w:val="1A365D"/>
                 <w:sz w:val="17"/>
               </w:rPr>
-              <w:t>Standard Requirement: Comprehensive site plan showing patio, pergola/covers, retaining walls, steps, setbacks, and drainage arrows.</w:t>
+              <w:t>Guideline Specification: Site plan showing patio, shade structures, walls, steps, setbacks, and drainage arrows.</w:t>
             </w:r>
           </w:p>
           <w:p>
@@ -6446,7 +6741,7 @@
                 <w:color w:val="1A365D"/>
                 <w:sz w:val="17"/>
               </w:rPr>
-              <w:t>Standard Requirement: Standalone planting plan showing tree locations with 5'-0" setback leader lines, drip line routing, and low-voltage lights.</w:t>
+              <w:t>Guideline Specification: Planting plan showing tree locations, setback leader lines, drip line routing, and lighting fixtures where applicable.</w:t>
             </w:r>
           </w:p>
           <w:p>
@@ -6457,7 +6752,7 @@
                 <w:color w:val="B7791F"/>
                 <w:sz w:val="17"/>
               </w:rPr>
-              <w:t>💡 TIP: Replace this placeholder with your Planting &amp; Irrigation Plan.</w:t>
+              <w:t>💡 TIP: Replace this placeholder with your Planting &amp; Irrigation Plan (or delete if not applicable).</w:t>
             </w:r>
             <w:r>
               <w:rPr>
@@ -6526,7 +6821,7 @@
                 <w:sz w:val="26"/>
               </w:rPr>
               <w:lastRenderedPageBreak/>
-              <w:t>EXHIBIT F: EXISTING PROPERTY SITE PHOTOGRAPHS</w:t>
+              <w:t>EXHIBIT F: EXISTING SITE PHOTOGRAPHS</w:t>
             </w:r>
           </w:p>
           <w:p>
@@ -6540,7 +6835,7 @@
                 <w:color w:val="E2E8F0"/>
                 <w:sz w:val="20"/>
               </w:rPr>
-              <w:t>COLOR ELEVATIONS &amp; SURROUNDING CONDITIONS</w:t>
+              <w:t>COLOR PHOTOGRAPHS &amp; SURROUNDING CONDITIONS</w:t>
             </w:r>
           </w:p>
         </w:tc>
@@ -6584,7 +6879,7 @@
                 <w:color w:val="B7791F"/>
                 <w:sz w:val="19"/>
               </w:rPr>
-              <w:t>💡 TIP / INSTRUCTION ONLY — SITE PHOTO TIPS</w:t>
+              <w:t>💡 TIP / INSTRUCTION ONLY — SITE PHOTOGRAPH GUIDANCE</w:t>
             </w:r>
             <w:r>
               <w:rPr>
@@ -6602,7 +6897,7 @@
                 <w:color w:val="2D3748"/>
                 <w:sz w:val="18"/>
               </w:rPr>
-              <w:t>Take 4 clear, well-lit color photographs representing existing lot conditions. These prove that existing walls and builder drainage have not been damaged prior to construction.</w:t>
+              <w:t>Provide clear color photographs showing existing conditions relevant to the proposed improvement. Typical views include front, rear, side yards, and adjacent surrounding conditions. Add additional photos as needed to document the project area.</w:t>
             </w:r>
           </w:p>
         </w:tc>
@@ -6674,7 +6969,7 @@
                 <w:color w:val="1A365D"/>
                 <w:sz w:val="17"/>
               </w:rPr>
-              <w:t>Standard Requirement: Existing front yard elevation showing entire facade, driveway, and street curb.</w:t>
+              <w:t>Guideline Specification: Existing front yard elevation showing facade, driveway, and street curb.</w:t>
             </w:r>
           </w:p>
           <w:p>
@@ -6685,7 +6980,7 @@
                 <w:color w:val="B7791F"/>
                 <w:sz w:val="17"/>
               </w:rPr>
-              <w:t>💡 TIP: Insert color photo showing the front of the house, driveway, and front curb.</w:t>
+              <w:t>💡 TIP: Insert color photo showing the front of the house and driveway.</w:t>
             </w:r>
             <w:r>
               <w:rPr>
@@ -6742,7 +7037,7 @@
                 <w:color w:val="FFFFFF"/>
                 <w:sz w:val="19"/>
               </w:rPr>
-              <w:t>📷 PHOTO 2: REAR YARD (FULL ELEVATION &amp; REAR SLOPE/FENCE)</w:t>
+              <w:t>📷 PHOTO 2: REAR YARD VIEW</w:t>
             </w:r>
           </w:p>
         </w:tc>
@@ -6770,7 +7065,7 @@
                 <w:color w:val="1A365D"/>
                 <w:sz w:val="17"/>
               </w:rPr>
-              <w:t>Standard Requirement: Existing backyard condition from the rear house wall looking towards the back fence/slope.</w:t>
+              <w:t>Guideline Specification: Existing backyard condition from the rear house wall looking towards the back fence/slope.</w:t>
             </w:r>
           </w:p>
           <w:p>
@@ -6781,7 +7076,7 @@
                 <w:color w:val="B7791F"/>
                 <w:sz w:val="17"/>
               </w:rPr>
-              <w:t>💡 TIP: Insert color photo showing the full backyard from the house looking towards rear fence.</w:t>
+              <w:t>💡 TIP: Insert color photo showing the backyard condition.</w:t>
             </w:r>
             <w:r>
               <w:rPr>
@@ -6844,7 +7139,7 @@
                 <w:sz w:val="19"/>
               </w:rPr>
               <w:lastRenderedPageBreak/>
-              <w:t>📷 PHOTO 3: LEFT SIDE YARD (TOWARDS LEFT FENCE / AMENITY AREA)</w:t>
+              <w:t>📷 PHOTO 3: SIDE YARD VIEW (LEFT)</w:t>
             </w:r>
           </w:p>
         </w:tc>
@@ -6872,7 +7167,7 @@
                 <w:color w:val="1A365D"/>
                 <w:sz w:val="17"/>
               </w:rPr>
-              <w:t>Standard Requirement: Existing left side yard condition between house wall and side boundary fence.</w:t>
+              <w:t>Guideline Specification: Existing left side yard condition between house wall and boundary fence.</w:t>
             </w:r>
           </w:p>
           <w:p>
@@ -6940,7 +7235,7 @@
                 <w:color w:val="FFFFFF"/>
                 <w:sz w:val="19"/>
               </w:rPr>
-              <w:t>📷 PHOTO 4: RIGHT SIDE YARD (TOWARDS RIGHT FENCE / SERVICE PAD)</w:t>
+              <w:t>📷 PHOTO 4: SIDE YARD VIEW (RIGHT)</w:t>
             </w:r>
           </w:p>
         </w:tc>
@@ -6968,7 +7263,7 @@
                 <w:color w:val="1A365D"/>
                 <w:sz w:val="17"/>
               </w:rPr>
-              <w:t>Standard Requirement: Existing right side yard condition showing AC condenser and side gate area.</w:t>
+              <w:t>Guideline Specification: Existing right side yard condition showing AC condenser, access gate, or service area.</w:t>
             </w:r>
           </w:p>
           <w:p>
@@ -6979,7 +7274,7 @@
                 <w:color w:val="B7791F"/>
                 <w:sz w:val="17"/>
               </w:rPr>
-              <w:t>💡 TIP: Insert color photo showing right side yard and side gate.</w:t>
+              <w:t>💡 TIP: Insert color photo showing the right side yard condition.</w:t>
             </w:r>
             <w:r>
               <w:rPr>
@@ -7045,7 +7340,7 @@
                 <w:sz w:val="26"/>
               </w:rPr>
               <w:lastRenderedPageBreak/>
-              <w:t>EXHIBIT G: PRODUCT CUT SHEETS &amp; MATERIAL SAMPLE EXHIBITS</w:t>
+              <w:t>EXHIBIT G: PRODUCT SPECIFICATIONS &amp; MATERIAL CUTS</w:t>
             </w:r>
           </w:p>
           <w:p>
@@ -7059,7 +7354,7 @@
                 <w:color w:val="E2E8F0"/>
                 <w:sz w:val="20"/>
               </w:rPr>
-              <w:t>SAMPLE PHOTOS, MATERIAL SWATCHES &amp; SPECIFICATIONS (MANDATORY ARC REQUIREMENT)</w:t>
+              <w:t>SUPPORTING PRODUCT INFORMATION — REQUIRED WHERE APPLICABLE</w:t>
             </w:r>
           </w:p>
         </w:tc>
@@ -7103,7 +7398,7 @@
                 <w:color w:val="B7791F"/>
                 <w:sz w:val="19"/>
               </w:rPr>
-              <w:t>💡 TIP / INSTRUCTION ONLY — CRITICAL ARC REQUIREMENT — PHOTOS &amp; SAMPLE CUTS FOR ALL PROPOSED ITEMS</w:t>
+              <w:t>💡 TIP / INSTRUCTION ONLY — PRODUCT SPECIFICATION GUIDANCE</w:t>
             </w:r>
             <w:r>
               <w:rPr>
@@ -7121,7 +7416,7 @@
                 <w:color w:val="2D3748"/>
                 <w:sz w:val="18"/>
               </w:rPr>
-              <w:t>The ARC requires sample photos or material cuts for ALL proposed items. Below is an unbiased modular gallery covering standard exterior improvements. INSTRUCTIONS FOR HOMEOWNER:</w:t>
+              <w:t>Provide manufacturer cut sheets, catalog photos, material swatches, or dimensions for proposed products where needed to allow the ARC to evaluate the application.</w:t>
             </w:r>
             <w:r>
               <w:rPr>
@@ -7131,17 +7426,7 @@
                 <w:sz w:val="18"/>
               </w:rPr>
               <w:br/>
-              <w:t>1. For any item you checked YES in Section 2, insert your manufacturer catalog cut sheet, online store spec page, or photo swatch into the corresponding box.</w:t>
-            </w:r>
-            <w:r>
-              <w:rPr>
-                <w:rFonts w:ascii="Calibri" w:hAnsi="Calibri"/>
-                <w:i/>
-                <w:color w:val="2D3748"/>
-                <w:sz w:val="18"/>
-              </w:rPr>
-              <w:br/>
-              <w:t>2. For any item you are NOT installing, simply DELETE that table/box completely so your submittal is clean and only shows what you are building.</w:t>
+              <w:t>INSTRUCTIONS: For any item you are installing, insert your product cut sheet or photo swatch into the corresponding box. For any item you are NOT installing, simply DELETE that box so your package remains clean and relevant.</w:t>
             </w:r>
           </w:p>
         </w:tc>
@@ -7213,7 +7498,7 @@
                 <w:color w:val="1A365D"/>
                 <w:sz w:val="17"/>
               </w:rPr>
-              <w:t>Standard Requirement: Non-combustible heavy-gauge extruded aluminum patio cover / louvered pergola (Slate Grey, Bronze, or Earth-tone finish). Meets CBC Chapter 7A / FPP Appendix B.</w:t>
+              <w:t>Guideline Specification: Heavy-gauge extruded aluminum or fire-resistant shade assembly (meeting FPP Appendix B / CBC Chapter 7A).</w:t>
             </w:r>
           </w:p>
           <w:p>
@@ -7224,7 +7509,7 @@
                 <w:color w:val="B7791F"/>
                 <w:sz w:val="17"/>
               </w:rPr>
-              <w:t>💡 TIP: Insert manufacturer cut sheet or catalog image of your proposed aluminum patio cover/pergola.</w:t>
+              <w:t>💡 TIP: Insert manufacturer cut sheet or catalog image of your proposed patio cover/pergola.</w:t>
             </w:r>
             <w:r>
               <w:rPr>
@@ -7309,7 +7594,7 @@
                 <w:color w:val="1A365D"/>
                 <w:sz w:val="17"/>
               </w:rPr>
-              <w:t>Standard Requirement: Natural stacked ledger stone veneer (split-face), brick, or stucco finish with smooth masonry cap. Height must be ≤ 24" from finished grade per Section IV.B.5.i.</w:t>
+              <w:t>Guideline Specification: Stacked ledger stone veneer, brick, or stucco finish with solid cap. Height ≤ 24" from finished grade per V12 §IV.B.5.i.</w:t>
             </w:r>
           </w:p>
           <w:p>
@@ -7411,7 +7696,7 @@
                 <w:color w:val="1A365D"/>
                 <w:sz w:val="17"/>
               </w:rPr>
-              <w:t>Standard Requirement: Natural concrete with broom-brush or stamped finish (1.0% positive drainage slope) or architectural concrete paver steppers surrounded by river rock/pebbles.</w:t>
+              <w:t>Guideline Specification: Natural concrete (broom-brush or stamped finish, 1.0% positive drainage slope) or architectural concrete paver steppers.</w:t>
             </w:r>
           </w:p>
           <w:p>
@@ -7507,7 +7792,7 @@
                 <w:color w:val="1A365D"/>
                 <w:sz w:val="17"/>
               </w:rPr>
-              <w:t>Standard Requirement: Self-contained electric recirculating fountain or water wall in neutral earth-tone cast stone (height under 6'-0" fence line, set back &gt;5'-0" from perimeter walls).</w:t>
+              <w:t>Guideline Specification: Self-contained electric recirculating fountain in neutral earth-tone cast stone (height under 6'-0" fence line, set back &gt;5'-0" from walls).</w:t>
             </w:r>
           </w:p>
           <w:p>
@@ -7609,7 +7894,7 @@
                 <w:color w:val="1A365D"/>
                 <w:sz w:val="17"/>
               </w:rPr>
-              <w:t>Standard Requirement: Non-combustible steel framing with stone/stucco finish. Natural gas with electronic ignition only (no wood-burning units). Set back &gt;5'-0" from fences.</w:t>
+              <w:t>Guideline Specification: Non-combustible framing with stone/stucco finish. Natural gas with electronic ignition only (no wood-burning units). Set back &gt;5'-0" from fences.</w:t>
             </w:r>
           </w:p>
           <w:p>
@@ -7705,7 +7990,7 @@
                 <w:color w:val="1A365D"/>
                 <w:sz w:val="17"/>
               </w:rPr>
-              <w:t>Standard Requirement: Weather-resistant, Class A fire-rated resin or metal storage shed (total height below 6'-0" fence line, placed in private yard).</w:t>
+              <w:t>Guideline Specification: Weather-resistant resin or metal storage shed (total height below 6'-0" fence line, placed in private yard).</w:t>
             </w:r>
           </w:p>
           <w:p>
@@ -7807,7 +8092,7 @@
                 <w:color w:val="1A365D"/>
                 <w:sz w:val="17"/>
               </w:rPr>
-              <w:t>Standard Requirement: Modular raised garden planter boxes constructed of exterior fire-retardant treated lumber (FRX) or heavy-gauge composite/metal, lined with drainage fabric.</w:t>
+              <w:t>Guideline Specification: Modular planter boxes constructed of exterior fire-retardant treated lumber or heavy-gauge composite/metal, lined with drainage fabric.</w:t>
             </w:r>
           </w:p>
           <w:p>
@@ -7875,7 +8160,7 @@
                 <w:color w:val="FFFFFF"/>
                 <w:sz w:val="19"/>
               </w:rPr>
-              <w:t>📷 ITEM 8: DETACHED ACCESSORY STRUCTURE (GREENHOUSE / GAZEBO / SHADE STRUCTURE)</w:t>
+              <w:t>📷 ITEM 8: DETACHED ACCESSORY STRUCTURE (GREENHOUSE / GAZEBO)</w:t>
             </w:r>
           </w:p>
         </w:tc>
@@ -7903,7 +8188,7 @@
                 <w:color w:val="1A365D"/>
                 <w:sz w:val="17"/>
               </w:rPr>
-              <w:t>Standard Requirement: Accessory structure with fire-retardant treated frame and shatter-resistant polycarbonate or solid non-combustible panels. Set back 3' from lot line / 5' from house.</w:t>
+              <w:t>Guideline Specification: Accessory structure with fire-retardant treated frame and shatter-resistant polycarbonate or solid non-combustible panels. Set back 3' from lot line / 5' from house.</w:t>
             </w:r>
           </w:p>
           <w:p>
@@ -8005,7 +8290,7 @@
                 <w:color w:val="1A365D"/>
                 <w:sz w:val="17"/>
               </w:rPr>
-              <w:t>Standard Requirement: Exterior fire-retardant treated wood frame or heavy-duty outdoor play structure placed in private yard (&gt;5' fence clearance, neighbors notified).</w:t>
+              <w:t>Guideline Specification: Exterior fire-retardant treated wood frame or outdoor play structure placed in private yard (&gt;5' fence clearance, neighbors notified).</w:t>
             </w:r>
           </w:p>
           <w:p>
@@ -8101,7 +8386,7 @@
                 <w:color w:val="1A365D"/>
                 <w:sz w:val="17"/>
               </w:rPr>
-              <w:t>Standard Requirement: Specification cut for synthetic grass (Class A Fire Rated, 10-yr warranty) OR natural sod irrigation layout, plus Class A brown bark mulch or rock ground cover.</w:t>
+              <w:t>Guideline Specification: Specification cut for synthetic grass (Class A Fire Rated, 10-yr warranty) OR natural sod irrigation layout, plus brown bark mulch or rock ground cover.</w:t>
             </w:r>
           </w:p>
           <w:p>
@@ -8319,31 +8604,31 @@
       </w:rPr>
     </w:lvl>
   </w:abstractNum>
-  <w:num w:numId="1" w16cid:durableId="903951849">
+  <w:num w:numId="1" w16cid:durableId="1784882113">
     <w:abstractNumId w:val="8"/>
   </w:num>
-  <w:num w:numId="2" w16cid:durableId="1917326233">
+  <w:num w:numId="2" w16cid:durableId="1166438364">
     <w:abstractNumId w:val="6"/>
   </w:num>
-  <w:num w:numId="3" w16cid:durableId="938760701">
+  <w:num w:numId="3" w16cid:durableId="445006304">
     <w:abstractNumId w:val="5"/>
   </w:num>
-  <w:num w:numId="4" w16cid:durableId="663706179">
+  <w:num w:numId="4" w16cid:durableId="652762753">
     <w:abstractNumId w:val="4"/>
   </w:num>
-  <w:num w:numId="5" w16cid:durableId="1437560882">
+  <w:num w:numId="5" w16cid:durableId="1484664246">
     <w:abstractNumId w:val="7"/>
   </w:num>
-  <w:num w:numId="6" w16cid:durableId="2032953148">
+  <w:num w:numId="6" w16cid:durableId="1049188435">
     <w:abstractNumId w:val="3"/>
   </w:num>
-  <w:num w:numId="7" w16cid:durableId="967978923">
+  <w:num w:numId="7" w16cid:durableId="883636492">
     <w:abstractNumId w:val="2"/>
   </w:num>
-  <w:num w:numId="8" w16cid:durableId="713889760">
+  <w:num w:numId="8" w16cid:durableId="1837304808">
     <w:abstractNumId w:val="1"/>
   </w:num>
-  <w:num w:numId="9" w16cid:durableId="1298871380">
+  <w:num w:numId="9" w16cid:durableId="2057241506">
     <w:abstractNumId w:val="0"/>
   </w:num>
 </w:numbering>

</xml_diff>